<commit_message>
Hướng dẫn Cho thuê, Kho, Kế toán: biên bản thu hồi ký hai bên, tất toán, sổ tại ngày; QA
- 06 Cho thuê: mục mới «Biên bản thu hồi — hai bên ký» (3 ảnh), sổ tại ngày; «Phần chưa có» bỏ
  hai mục đã làm, thêm biên bản giao hàng và biên bản điều chỉnh (chưa có).
- 05 Kho: «Cho thuê được» chỉ tính giáo ở kho, «Xem sổ tại ngày».
- 04 Kế toán: mục mới «Thuê giàn giáo — đối soát và tất toán».
- KIEM_THU_QA: E-07, F-07, F-08, G-07→G-10, L-22→L-25.

Co-Authored-By: Claude Opus 5.5 <noreply@anthropic.com>
</commit_message>
<xml_diff>
--- a/doc/demo/huong-dan/04_KE_TOAN.docx
+++ b/doc/demo/huong-dan/04_KE_TOAN.docx
@@ -610,7 +610,7 @@
           <w:sz w:val="21"/>
           <w:szCs w:val="21"/>
         </w:rPr>
-        <w:t xml:space="preserve">10. Dòng tiền</w:t>
+        <w:t xml:space="preserve">10. Thuê giàn giáo — đối soát và tất toán</w:t>
       </w:r>
     </w:p>
     <w:p>
@@ -627,7 +627,7 @@
           <w:sz w:val="21"/>
           <w:szCs w:val="21"/>
         </w:rPr>
-        <w:t xml:space="preserve">11. Kỳ kế toán</w:t>
+        <w:t xml:space="preserve">11. Dòng tiền</w:t>
       </w:r>
     </w:p>
     <w:p>
@@ -644,7 +644,24 @@
           <w:sz w:val="21"/>
           <w:szCs w:val="21"/>
         </w:rPr>
-        <w:t xml:space="preserve">12. Câu hỏi thường gặp</w:t>
+        <w:t xml:space="preserve">12. Kỳ kế toán</w:t>
+      </w:r>
+    </w:p>
+    <w:p>
+      <w:pPr>
+        <w:spacing w:after="60" w:line="264"/>
+        <w:ind w:left="0"/>
+      </w:pPr>
+      <w:r>
+        <w:rPr>
+          <w:rFonts w:ascii="Calibri" w:cs="Calibri" w:eastAsia="Calibri" w:hAnsi="Calibri"/>
+          <w:b/>
+          <w:bCs/>
+          <w:color w:val="1F2933"/>
+          <w:sz w:val="21"/>
+          <w:szCs w:val="21"/>
+        </w:rPr>
+        <w:t xml:space="preserve">13. Câu hỏi thường gặp</w:t>
       </w:r>
     </w:p>
     <w:p>
@@ -730,9 +747,9 @@
         </w:tblBorders>
       </w:tblPr>
       <w:tblGrid>
-        <w:gridCol w:w="3877"/>
+        <w:gridCol w:w="3886"/>
         <w:gridCol w:w="2934"/>
-        <w:gridCol w:w="2827"/>
+        <w:gridCol w:w="2818"/>
       </w:tblGrid>
       <w:tr>
         <w:trPr>
@@ -740,7 +757,7 @@
         </w:trPr>
         <w:tc>
           <w:tcPr>
-            <w:tcW w:type="dxa" w:w="3877"/>
+            <w:tcW w:type="dxa" w:w="3886"/>
             <w:shd w:fill="EAF1EE" w:color="auto" w:val="clear"/>
             <w:tcMar>
               <w:top w:type="dxa" w:w="60"/>
@@ -800,7 +817,7 @@
         </w:tc>
         <w:tc>
           <w:tcPr>
-            <w:tcW w:type="dxa" w:w="2827"/>
+            <w:tcW w:type="dxa" w:w="2818"/>
             <w:shd w:fill="EAF1EE" w:color="auto" w:val="clear"/>
             <w:tcMar>
               <w:top w:type="dxa" w:w="60"/>
@@ -835,7 +852,7 @@
         </w:trPr>
         <w:tc>
           <w:tcPr>
-            <w:tcW w:type="dxa" w:w="3877"/>
+            <w:tcW w:type="dxa" w:w="3886"/>
             <w:tcMar>
               <w:top w:type="dxa" w:w="60"/>
               <w:left w:type="dxa" w:w="90"/>
@@ -932,7 +949,7 @@
         </w:tc>
         <w:tc>
           <w:tcPr>
-            <w:tcW w:type="dxa" w:w="2827"/>
+            <w:tcW w:type="dxa" w:w="2818"/>
             <w:tcMar>
               <w:top w:type="dxa" w:w="60"/>
               <w:left w:type="dxa" w:w="90"/>
@@ -966,7 +983,7 @@
         </w:trPr>
         <w:tc>
           <w:tcPr>
-            <w:tcW w:type="dxa" w:w="3877"/>
+            <w:tcW w:type="dxa" w:w="3886"/>
             <w:tcMar>
               <w:top w:type="dxa" w:w="60"/>
               <w:left w:type="dxa" w:w="90"/>
@@ -1037,7 +1054,7 @@
         </w:tc>
         <w:tc>
           <w:tcPr>
-            <w:tcW w:type="dxa" w:w="2827"/>
+            <w:tcW w:type="dxa" w:w="2818"/>
             <w:tcMar>
               <w:top w:type="dxa" w:w="60"/>
               <w:left w:type="dxa" w:w="90"/>
@@ -1071,7 +1088,7 @@
         </w:trPr>
         <w:tc>
           <w:tcPr>
-            <w:tcW w:type="dxa" w:w="3877"/>
+            <w:tcW w:type="dxa" w:w="3886"/>
             <w:tcMar>
               <w:top w:type="dxa" w:w="60"/>
               <w:left w:type="dxa" w:w="90"/>
@@ -1142,7 +1159,7 @@
         </w:tc>
         <w:tc>
           <w:tcPr>
-            <w:tcW w:type="dxa" w:w="2827"/>
+            <w:tcW w:type="dxa" w:w="2818"/>
             <w:tcMar>
               <w:top w:type="dxa" w:w="60"/>
               <w:left w:type="dxa" w:w="90"/>
@@ -1176,7 +1193,7 @@
         </w:trPr>
         <w:tc>
           <w:tcPr>
-            <w:tcW w:type="dxa" w:w="3877"/>
+            <w:tcW w:type="dxa" w:w="3886"/>
             <w:tcMar>
               <w:top w:type="dxa" w:w="60"/>
               <w:left w:type="dxa" w:w="90"/>
@@ -1234,7 +1251,7 @@
         </w:tc>
         <w:tc>
           <w:tcPr>
-            <w:tcW w:type="dxa" w:w="2827"/>
+            <w:tcW w:type="dxa" w:w="2818"/>
             <w:tcMar>
               <w:top w:type="dxa" w:w="60"/>
               <w:left w:type="dxa" w:w="90"/>
@@ -1268,7 +1285,7 @@
         </w:trPr>
         <w:tc>
           <w:tcPr>
-            <w:tcW w:type="dxa" w:w="3877"/>
+            <w:tcW w:type="dxa" w:w="3886"/>
             <w:tcMar>
               <w:top w:type="dxa" w:w="60"/>
               <w:left w:type="dxa" w:w="90"/>
@@ -1326,7 +1343,7 @@
         </w:tc>
         <w:tc>
           <w:tcPr>
-            <w:tcW w:type="dxa" w:w="2827"/>
+            <w:tcW w:type="dxa" w:w="2818"/>
             <w:tcMar>
               <w:top w:type="dxa" w:w="60"/>
               <w:left w:type="dxa" w:w="90"/>
@@ -1360,7 +1377,7 @@
         </w:trPr>
         <w:tc>
           <w:tcPr>
-            <w:tcW w:type="dxa" w:w="3877"/>
+            <w:tcW w:type="dxa" w:w="3886"/>
             <w:tcMar>
               <w:top w:type="dxa" w:w="60"/>
               <w:left w:type="dxa" w:w="90"/>
@@ -1418,7 +1435,7 @@
         </w:tc>
         <w:tc>
           <w:tcPr>
-            <w:tcW w:type="dxa" w:w="2827"/>
+            <w:tcW w:type="dxa" w:w="2818"/>
             <w:tcMar>
               <w:top w:type="dxa" w:w="60"/>
               <w:left w:type="dxa" w:w="90"/>
@@ -1452,7 +1469,7 @@
         </w:trPr>
         <w:tc>
           <w:tcPr>
-            <w:tcW w:type="dxa" w:w="3877"/>
+            <w:tcW w:type="dxa" w:w="3886"/>
             <w:tcMar>
               <w:top w:type="dxa" w:w="60"/>
               <w:left w:type="dxa" w:w="90"/>
@@ -1475,7 +1492,7 @@
                 <w:sz w:val="19"/>
                 <w:szCs w:val="19"/>
               </w:rPr>
-              <w:t xml:space="preserve">Lập kế hoạch dòng tiền kỳ</w:t>
+              <w:t xml:space="preserve">Đối soát biên bản thu hồi giàn giáo, tất toán hợp đồng thuê</w:t>
             </w:r>
           </w:p>
         </w:tc>
@@ -1504,13 +1521,26 @@
                 <w:sz w:val="19"/>
                 <w:szCs w:val="19"/>
               </w:rPr>
-              <w:t xml:space="preserve">Dòng tiền</w:t>
+              <w:t xml:space="preserve">Thuê giàn giáo</w:t>
+            </w:r>
+            <w:r>
+              <w:rPr>
+                <w:rFonts w:ascii="Calibri" w:cs="Calibri" w:eastAsia="Calibri" w:hAnsi="Calibri"/>
+                <w:b w:val="false"/>
+                <w:bCs w:val="false"/>
+                <w:i w:val="false"/>
+                <w:iCs w:val="false"/>
+                <w:color w:val="1F2933"/>
+                <w:sz w:val="19"/>
+                <w:szCs w:val="19"/>
+              </w:rPr>
+              <w:t xml:space="preserve"> (Nhà Việt Steel)</w:t>
             </w:r>
           </w:p>
         </w:tc>
         <w:tc>
           <w:tcPr>
-            <w:tcW w:type="dxa" w:w="2827"/>
+            <w:tcW w:type="dxa" w:w="2818"/>
             <w:tcMar>
               <w:top w:type="dxa" w:w="60"/>
               <w:left w:type="dxa" w:w="90"/>
@@ -1533,7 +1563,7 @@
                 <w:sz w:val="19"/>
                 <w:szCs w:val="19"/>
               </w:rPr>
-              <w:t xml:space="preserve">Đầu kỳ</w:t>
+              <w:t xml:space="preserve">Khi khách trả hết giàn giáo</w:t>
             </w:r>
           </w:p>
         </w:tc>
@@ -1544,7 +1574,7 @@
         </w:trPr>
         <w:tc>
           <w:tcPr>
-            <w:tcW w:type="dxa" w:w="3877"/>
+            <w:tcW w:type="dxa" w:w="3886"/>
             <w:tcMar>
               <w:top w:type="dxa" w:w="60"/>
               <w:left w:type="dxa" w:w="90"/>
@@ -1567,7 +1597,7 @@
                 <w:sz w:val="19"/>
                 <w:szCs w:val="19"/>
               </w:rPr>
-              <w:t xml:space="preserve">Mở, khóa, mở lại kỳ kế toán</w:t>
+              <w:t xml:space="preserve">Lập kế hoạch dòng tiền kỳ</w:t>
             </w:r>
           </w:p>
         </w:tc>
@@ -1596,13 +1626,105 @@
                 <w:sz w:val="19"/>
                 <w:szCs w:val="19"/>
               </w:rPr>
-              <w:t xml:space="preserve">Kỳ kế toán</w:t>
+              <w:t xml:space="preserve">Dòng tiền</w:t>
             </w:r>
           </w:p>
         </w:tc>
         <w:tc>
           <w:tcPr>
-            <w:tcW w:type="dxa" w:w="2827"/>
+            <w:tcW w:type="dxa" w:w="2818"/>
+            <w:tcMar>
+              <w:top w:type="dxa" w:w="60"/>
+              <w:left w:type="dxa" w:w="90"/>
+              <w:bottom w:type="dxa" w:w="60"/>
+              <w:right w:type="dxa" w:w="90"/>
+            </w:tcMar>
+          </w:tcPr>
+          <w:p>
+            <w:pPr>
+              <w:spacing w:after="0" w:line="252"/>
+            </w:pPr>
+            <w:r>
+              <w:rPr>
+                <w:rFonts w:ascii="Calibri" w:cs="Calibri" w:eastAsia="Calibri" w:hAnsi="Calibri"/>
+                <w:b w:val="false"/>
+                <w:bCs w:val="false"/>
+                <w:i w:val="false"/>
+                <w:iCs w:val="false"/>
+                <w:color w:val="1F2933"/>
+                <w:sz w:val="19"/>
+                <w:szCs w:val="19"/>
+              </w:rPr>
+              <w:t xml:space="preserve">Đầu kỳ</w:t>
+            </w:r>
+          </w:p>
+        </w:tc>
+      </w:tr>
+      <w:tr>
+        <w:trPr>
+          <w:cantSplit/>
+        </w:trPr>
+        <w:tc>
+          <w:tcPr>
+            <w:tcW w:type="dxa" w:w="3886"/>
+            <w:tcMar>
+              <w:top w:type="dxa" w:w="60"/>
+              <w:left w:type="dxa" w:w="90"/>
+              <w:bottom w:type="dxa" w:w="60"/>
+              <w:right w:type="dxa" w:w="90"/>
+            </w:tcMar>
+          </w:tcPr>
+          <w:p>
+            <w:pPr>
+              <w:spacing w:after="0" w:line="252"/>
+            </w:pPr>
+            <w:r>
+              <w:rPr>
+                <w:rFonts w:ascii="Calibri" w:cs="Calibri" w:eastAsia="Calibri" w:hAnsi="Calibri"/>
+                <w:b w:val="false"/>
+                <w:bCs w:val="false"/>
+                <w:i w:val="false"/>
+                <w:iCs w:val="false"/>
+                <w:color w:val="1F2933"/>
+                <w:sz w:val="19"/>
+                <w:szCs w:val="19"/>
+              </w:rPr>
+              <w:t xml:space="preserve">Mở, khóa, mở lại kỳ kế toán</w:t>
+            </w:r>
+          </w:p>
+        </w:tc>
+        <w:tc>
+          <w:tcPr>
+            <w:tcW w:type="dxa" w:w="2934"/>
+            <w:tcMar>
+              <w:top w:type="dxa" w:w="60"/>
+              <w:left w:type="dxa" w:w="90"/>
+              <w:bottom w:type="dxa" w:w="60"/>
+              <w:right w:type="dxa" w:w="90"/>
+            </w:tcMar>
+          </w:tcPr>
+          <w:p>
+            <w:pPr>
+              <w:spacing w:after="0" w:line="252"/>
+            </w:pPr>
+            <w:r>
+              <w:rPr>
+                <w:rFonts w:ascii="Calibri" w:cs="Calibri" w:eastAsia="Calibri" w:hAnsi="Calibri"/>
+                <w:b/>
+                <w:bCs/>
+                <w:i w:val="false"/>
+                <w:iCs w:val="false"/>
+                <w:color w:val="1F2933"/>
+                <w:sz w:val="19"/>
+                <w:szCs w:val="19"/>
+              </w:rPr>
+              <w:t xml:space="preserve">Kỳ kế toán</w:t>
+            </w:r>
+          </w:p>
+        </w:tc>
+        <w:tc>
+          <w:tcPr>
+            <w:tcW w:type="dxa" w:w="2818"/>
             <w:tcMar>
               <w:top w:type="dxa" w:w="60"/>
               <w:left w:type="dxa" w:w="90"/>
@@ -5258,7 +5380,7 @@
           <w:sz w:val="30"/>
           <w:szCs w:val="30"/>
         </w:rPr>
-        <w:t xml:space="preserve">10. Dòng tiền</w:t>
+        <w:t xml:space="preserve">10. Thuê giàn giáo — đối soát và tất toán</w:t>
       </w:r>
     </w:p>
     <w:p>
@@ -5269,80 +5391,164 @@
       <w:r>
         <w:rPr>
           <w:rFonts w:ascii="Calibri" w:cs="Calibri" w:eastAsia="Calibri" w:hAnsi="Calibri"/>
-          <w:b/>
-          <w:bCs/>
-          <w:i w:val="false"/>
-          <w:iCs w:val="false"/>
-          <w:color w:val="1F2933"/>
-          <w:sz w:val="21"/>
-          <w:szCs w:val="21"/>
-        </w:rPr>
-        <w:t xml:space="preserve">Dòng tiền</w:t>
-      </w:r>
-      <w:r>
-        <w:rPr>
-          <w:rFonts w:ascii="Calibri" w:cs="Calibri" w:eastAsia="Calibri" w:hAnsi="Calibri"/>
-          <w:b w:val="false"/>
-          <w:bCs w:val="false"/>
-          <w:i w:val="false"/>
-          <w:iCs w:val="false"/>
-          <w:color w:val="1F2933"/>
-          <w:sz w:val="21"/>
-          <w:szCs w:val="21"/>
-        </w:rPr>
-        <w:t xml:space="preserve"> đặt cạnh nhau cho từng pháp nhân: số dư đầu kỳ, dự kiến thu, công nợ đến hạn thu, dự kiến chi, công nợ đến hạn trả, </w:t>
-      </w:r>
-      <w:r>
-        <w:rPr>
-          <w:rFonts w:ascii="Calibri" w:cs="Calibri" w:eastAsia="Calibri" w:hAnsi="Calibri"/>
-          <w:b/>
-          <w:bCs/>
-          <w:i w:val="false"/>
-          <w:iCs w:val="false"/>
-          <w:color w:val="1F2933"/>
-          <w:sz w:val="21"/>
-          <w:szCs w:val="21"/>
-        </w:rPr>
-        <w:t xml:space="preserve">khoản đã duyệt nhưng chưa chi</w:t>
-      </w:r>
-      <w:r>
-        <w:rPr>
-          <w:rFonts w:ascii="Calibri" w:cs="Calibri" w:eastAsia="Calibri" w:hAnsi="Calibri"/>
-          <w:b w:val="false"/>
-          <w:bCs w:val="false"/>
-          <w:i w:val="false"/>
-          <w:iCs w:val="false"/>
-          <w:color w:val="1F2933"/>
-          <w:sz w:val="21"/>
-          <w:szCs w:val="21"/>
-        </w:rPr>
-        <w:t xml:space="preserve">, và </w:t>
-      </w:r>
-      <w:r>
-        <w:rPr>
-          <w:rFonts w:ascii="Calibri" w:cs="Calibri" w:eastAsia="Calibri" w:hAnsi="Calibri"/>
-          <w:b/>
-          <w:bCs/>
-          <w:i w:val="false"/>
-          <w:iCs w:val="false"/>
-          <w:color w:val="1F2933"/>
-          <w:sz w:val="21"/>
-          <w:szCs w:val="21"/>
-        </w:rPr>
-        <w:t xml:space="preserve">số dư cuối kỳ dự kiến</w:t>
-      </w:r>
-      <w:r>
-        <w:rPr>
-          <w:rFonts w:ascii="Calibri" w:cs="Calibri" w:eastAsia="Calibri" w:hAnsi="Calibri"/>
-          <w:b w:val="false"/>
-          <w:bCs w:val="false"/>
-          <w:i w:val="false"/>
-          <w:iCs w:val="false"/>
-          <w:color w:val="1F2933"/>
-          <w:sz w:val="21"/>
-          <w:szCs w:val="21"/>
-        </w:rPr>
-        <w:t xml:space="preserve">. Chỗ âm được chỉ ra; hệ thống không kết luận nên hoãn khoản nào.</w:t>
+          <w:b w:val="false"/>
+          <w:bCs w:val="false"/>
+          <w:i w:val="false"/>
+          <w:iCs w:val="false"/>
+          <w:color w:val="1F2933"/>
+          <w:sz w:val="21"/>
+          <w:szCs w:val="21"/>
+        </w:rPr>
+        <w:t xml:space="preserve">Chọn </w:t>
+      </w:r>
+      <w:r>
+        <w:rPr>
+          <w:rFonts w:ascii="Calibri" w:cs="Calibri" w:eastAsia="Calibri" w:hAnsi="Calibri"/>
+          <w:b/>
+          <w:bCs/>
+          <w:i w:val="false"/>
+          <w:iCs w:val="false"/>
+          <w:color w:val="1F2933"/>
+          <w:sz w:val="21"/>
+          <w:szCs w:val="21"/>
+        </w:rPr>
+        <w:t xml:space="preserve">Nhà Việt Steel</w:t>
+      </w:r>
+      <w:r>
+        <w:rPr>
+          <w:rFonts w:ascii="Calibri" w:cs="Calibri" w:eastAsia="Calibri" w:hAnsi="Calibri"/>
+          <w:b w:val="false"/>
+          <w:bCs w:val="false"/>
+          <w:i w:val="false"/>
+          <w:iCs w:val="false"/>
+          <w:color w:val="1F2933"/>
+          <w:sz w:val="21"/>
+          <w:szCs w:val="21"/>
+        </w:rPr>
+        <w:t xml:space="preserve"> ở góc trên bên trái → </w:t>
+      </w:r>
+      <w:r>
+        <w:rPr>
+          <w:rFonts w:ascii="Calibri" w:cs="Calibri" w:eastAsia="Calibri" w:hAnsi="Calibri"/>
+          <w:b/>
+          <w:bCs/>
+          <w:i w:val="false"/>
+          <w:iCs w:val="false"/>
+          <w:color w:val="1F2933"/>
+          <w:sz w:val="21"/>
+          <w:szCs w:val="21"/>
+        </w:rPr>
+        <w:t xml:space="preserve">Thuê giàn giáo</w:t>
+      </w:r>
+      <w:r>
+        <w:rPr>
+          <w:rFonts w:ascii="Calibri" w:cs="Calibri" w:eastAsia="Calibri" w:hAnsi="Calibri"/>
+          <w:b w:val="false"/>
+          <w:bCs w:val="false"/>
+          <w:i w:val="false"/>
+          <w:iCs w:val="false"/>
+          <w:color w:val="1F2933"/>
+          <w:sz w:val="21"/>
+          <w:szCs w:val="21"/>
+        </w:rPr>
+        <w:t xml:space="preserve">.</w:t>
+      </w:r>
+    </w:p>
+    <w:p>
+      <w:pPr>
+        <w:spacing w:after="140" w:line="276"/>
+        <w:jc w:val="left"/>
+      </w:pPr>
+      <w:r>
+        <w:rPr>
+          <w:rFonts w:ascii="Calibri" w:cs="Calibri" w:eastAsia="Calibri" w:hAnsi="Calibri"/>
+          <w:b w:val="false"/>
+          <w:bCs w:val="false"/>
+          <w:i w:val="false"/>
+          <w:iCs w:val="false"/>
+          <w:color w:val="1F2933"/>
+          <w:sz w:val="21"/>
+          <w:szCs w:val="21"/>
+        </w:rPr>
+        <w:t xml:space="preserve">Mỗi lần khách trả giàn giáo, Xưởng lập </w:t>
+      </w:r>
+      <w:r>
+        <w:rPr>
+          <w:rFonts w:ascii="Calibri" w:cs="Calibri" w:eastAsia="Calibri" w:hAnsi="Calibri"/>
+          <w:b/>
+          <w:bCs/>
+          <w:i w:val="false"/>
+          <w:iCs w:val="false"/>
+          <w:color w:val="1F2933"/>
+          <w:sz w:val="21"/>
+          <w:szCs w:val="21"/>
+        </w:rPr>
+        <w:t xml:space="preserve">biên bản thu hồi</w:t>
+      </w:r>
+      <w:r>
+        <w:rPr>
+          <w:rFonts w:ascii="Calibri" w:cs="Calibri" w:eastAsia="Calibri" w:hAnsi="Calibri"/>
+          <w:b w:val="false"/>
+          <w:bCs w:val="false"/>
+          <w:i w:val="false"/>
+          <w:iCs w:val="false"/>
+          <w:color w:val="1F2933"/>
+          <w:sz w:val="21"/>
+          <w:szCs w:val="21"/>
+        </w:rPr>
+        <w:t xml:space="preserve"> và hai bên ký (trên màn hình hoặc ký giấy rồi chụp ảnh). Ký xong, biên bản bị khoá và Kế toán </w:t>
+      </w:r>
+      <w:r>
+        <w:rPr>
+          <w:rFonts w:ascii="Calibri" w:cs="Calibri" w:eastAsia="Calibri" w:hAnsi="Calibri"/>
+          <w:b/>
+          <w:bCs/>
+          <w:i w:val="false"/>
+          <w:iCs w:val="false"/>
+          <w:color w:val="1F2933"/>
+          <w:sz w:val="21"/>
+          <w:szCs w:val="21"/>
+        </w:rPr>
+        <w:t xml:space="preserve">tự nhận một khoản phải thu</w:t>
+      </w:r>
+      <w:r>
+        <w:rPr>
+          <w:rFonts w:ascii="Calibri" w:cs="Calibri" w:eastAsia="Calibri" w:hAnsi="Calibri"/>
+          <w:b w:val="false"/>
+          <w:bCs w:val="false"/>
+          <w:i w:val="false"/>
+          <w:iCs w:val="false"/>
+          <w:color w:val="1F2933"/>
+          <w:sz w:val="21"/>
+          <w:szCs w:val="21"/>
+        </w:rPr>
+        <w:t xml:space="preserve"> ở </w:t>
+      </w:r>
+      <w:r>
+        <w:rPr>
+          <w:rFonts w:ascii="Calibri" w:cs="Calibri" w:eastAsia="Calibri" w:hAnsi="Calibri"/>
+          <w:b/>
+          <w:bCs/>
+          <w:i w:val="false"/>
+          <w:iCs w:val="false"/>
+          <w:color w:val="1F2933"/>
+          <w:sz w:val="21"/>
+          <w:szCs w:val="21"/>
+        </w:rPr>
+        <w:t xml:space="preserve">Công nợ</w:t>
+      </w:r>
+      <w:r>
+        <w:rPr>
+          <w:rFonts w:ascii="Calibri" w:cs="Calibri" w:eastAsia="Calibri" w:hAnsi="Calibri"/>
+          <w:b w:val="false"/>
+          <w:bCs w:val="false"/>
+          <w:i w:val="false"/>
+          <w:iCs w:val="false"/>
+          <w:color w:val="1F2933"/>
+          <w:sz w:val="21"/>
+          <w:szCs w:val="21"/>
+        </w:rPr>
+        <w:t xml:space="preserve">: tiền thuê và bồi thường của đợt đó, ghi rõ mã hợp đồng và mã biên bản. Không ai phải báo số qua Zalo hay gõ lại.</w:t>
       </w:r>
     </w:p>
     <w:p>
@@ -5406,65 +5612,447 @@
           <w:sz w:val="18"/>
           <w:szCs w:val="18"/>
         </w:rPr>
-        <w:t xml:space="preserve">Hình 13 — Dòng tiền tháng 9 của Nhà Việt Cons.</w:t>
-      </w:r>
-    </w:p>
-    <w:p>
-      <w:pPr>
-        <w:spacing w:after="140" w:line="276"/>
-        <w:jc w:val="left"/>
-      </w:pPr>
-      <w:r>
-        <w:rPr>
-          <w:rFonts w:ascii="Calibri" w:cs="Calibri" w:eastAsia="Calibri" w:hAnsi="Calibri"/>
-          <w:b/>
-          <w:bCs/>
-          <w:i w:val="false"/>
-          <w:iCs w:val="false"/>
-          <w:color w:val="1F2933"/>
-          <w:sz w:val="21"/>
-          <w:szCs w:val="21"/>
-        </w:rPr>
-        <w:t xml:space="preserve">Lập kế hoạch kỳ</w:t>
-      </w:r>
-      <w:r>
-        <w:rPr>
-          <w:rFonts w:ascii="Calibri" w:cs="Calibri" w:eastAsia="Calibri" w:hAnsi="Calibri"/>
-          <w:b w:val="false"/>
-          <w:bCs w:val="false"/>
-          <w:i w:val="false"/>
-          <w:iCs w:val="false"/>
-          <w:color w:val="1F2933"/>
-          <w:sz w:val="21"/>
-          <w:szCs w:val="21"/>
-        </w:rPr>
-        <w:t xml:space="preserve">: kỳ, từ ngày – đến ngày, </w:t>
-      </w:r>
-      <w:r>
-        <w:rPr>
-          <w:rFonts w:ascii="Calibri" w:cs="Calibri" w:eastAsia="Calibri" w:hAnsi="Calibri"/>
-          <w:b/>
-          <w:bCs/>
-          <w:i w:val="false"/>
-          <w:iCs w:val="false"/>
-          <w:color w:val="1F2933"/>
-          <w:sz w:val="21"/>
-          <w:szCs w:val="21"/>
-        </w:rPr>
-        <w:t xml:space="preserve">số dư đầu kỳ</w:t>
-      </w:r>
-      <w:r>
-        <w:rPr>
-          <w:rFonts w:ascii="Calibri" w:cs="Calibri" w:eastAsia="Calibri" w:hAnsi="Calibri"/>
-          <w:b w:val="false"/>
-          <w:bCs w:val="false"/>
-          <w:i w:val="false"/>
-          <w:iCs w:val="false"/>
-          <w:color w:val="1F2933"/>
-          <w:sz w:val="21"/>
-          <w:szCs w:val="21"/>
-        </w:rPr>
-        <w:t xml:space="preserve"> (nhập tay theo sao kê — hệ thống không nối ngân hàng điện tử), dự kiến thu, dự kiến chi, nguồn số dư. Chưa lập kế hoạch thì thẻ Dòng tiền trên Dashboard ghi «Chưa đủ dữ liệu» thay vì «0 đồng».</w:t>
+        <w:t xml:space="preserve">Hình 13 — Hợp đồng Đông Đô: một biên bản đã ký, 7.149.600 đồng đã thành khoản phải thu.</w:t>
+      </w:r>
+    </w:p>
+    <w:p>
+      <w:pPr>
+        <w:pStyle w:val="ListParagraph"/>
+        <w:numPr>
+          <w:ilvl w:val="0"/>
+          <w:numId w:val="2"/>
+        </w:numPr>
+        <w:spacing w:after="70" w:line="276"/>
+      </w:pPr>
+      <w:r>
+        <w:rPr>
+          <w:rFonts w:ascii="Calibri" w:cs="Calibri" w:eastAsia="Calibri" w:hAnsi="Calibri"/>
+          <w:b w:val="false"/>
+          <w:bCs w:val="false"/>
+          <w:i w:val="false"/>
+          <w:iCs w:val="false"/>
+          <w:color w:val="1F2933"/>
+          <w:sz w:val="21"/>
+          <w:szCs w:val="21"/>
+        </w:rPr>
+        <w:t xml:space="preserve">Mỗi hợp đồng một dòng: </w:t>
+      </w:r>
+      <w:r>
+        <w:rPr>
+          <w:rFonts w:ascii="Calibri" w:cs="Calibri" w:eastAsia="Calibri" w:hAnsi="Calibri"/>
+          <w:b/>
+          <w:bCs/>
+          <w:i w:val="false"/>
+          <w:iCs w:val="false"/>
+          <w:color w:val="1F2933"/>
+          <w:sz w:val="21"/>
+          <w:szCs w:val="21"/>
+        </w:rPr>
+        <w:t xml:space="preserve">biên bản đã chốt</w:t>
+      </w:r>
+      <w:r>
+        <w:rPr>
+          <w:rFonts w:ascii="Calibri" w:cs="Calibri" w:eastAsia="Calibri" w:hAnsi="Calibri"/>
+          <w:b w:val="false"/>
+          <w:bCs w:val="false"/>
+          <w:i w:val="false"/>
+          <w:iCs w:val="false"/>
+          <w:color w:val="1F2933"/>
+          <w:sz w:val="21"/>
+          <w:szCs w:val="21"/>
+        </w:rPr>
+        <w:t xml:space="preserve">, </w:t>
+      </w:r>
+      <w:r>
+        <w:rPr>
+          <w:rFonts w:ascii="Calibri" w:cs="Calibri" w:eastAsia="Calibri" w:hAnsi="Calibri"/>
+          <w:b/>
+          <w:bCs/>
+          <w:i w:val="false"/>
+          <w:iCs w:val="false"/>
+          <w:color w:val="1F2933"/>
+          <w:sz w:val="21"/>
+          <w:szCs w:val="21"/>
+        </w:rPr>
+        <w:t xml:space="preserve">đã thành phải thu</w:t>
+      </w:r>
+      <w:r>
+        <w:rPr>
+          <w:rFonts w:ascii="Calibri" w:cs="Calibri" w:eastAsia="Calibri" w:hAnsi="Calibri"/>
+          <w:b w:val="false"/>
+          <w:bCs w:val="false"/>
+          <w:i w:val="false"/>
+          <w:iCs w:val="false"/>
+          <w:color w:val="1F2933"/>
+          <w:sz w:val="21"/>
+          <w:szCs w:val="21"/>
+        </w:rPr>
+        <w:t xml:space="preserve">, </w:t>
+      </w:r>
+      <w:r>
+        <w:rPr>
+          <w:rFonts w:ascii="Calibri" w:cs="Calibri" w:eastAsia="Calibri" w:hAnsi="Calibri"/>
+          <w:b/>
+          <w:bCs/>
+          <w:i w:val="false"/>
+          <w:iCs w:val="false"/>
+          <w:color w:val="1F2933"/>
+          <w:sz w:val="21"/>
+          <w:szCs w:val="21"/>
+        </w:rPr>
+        <w:t xml:space="preserve">đã thu</w:t>
+      </w:r>
+      <w:r>
+        <w:rPr>
+          <w:rFonts w:ascii="Calibri" w:cs="Calibri" w:eastAsia="Calibri" w:hAnsi="Calibri"/>
+          <w:b w:val="false"/>
+          <w:bCs w:val="false"/>
+          <w:i w:val="false"/>
+          <w:iCs w:val="false"/>
+          <w:color w:val="1F2933"/>
+          <w:sz w:val="21"/>
+          <w:szCs w:val="21"/>
+        </w:rPr>
+        <w:t xml:space="preserve">, </w:t>
+      </w:r>
+      <w:r>
+        <w:rPr>
+          <w:rFonts w:ascii="Calibri" w:cs="Calibri" w:eastAsia="Calibri" w:hAnsi="Calibri"/>
+          <w:b/>
+          <w:bCs/>
+          <w:i w:val="false"/>
+          <w:iCs w:val="false"/>
+          <w:color w:val="1F2933"/>
+          <w:sz w:val="21"/>
+          <w:szCs w:val="21"/>
+        </w:rPr>
+        <w:t xml:space="preserve">tiền đặt cọc</w:t>
+      </w:r>
+      <w:r>
+        <w:rPr>
+          <w:rFonts w:ascii="Calibri" w:cs="Calibri" w:eastAsia="Calibri" w:hAnsi="Calibri"/>
+          <w:b w:val="false"/>
+          <w:bCs w:val="false"/>
+          <w:i w:val="false"/>
+          <w:iCs w:val="false"/>
+          <w:color w:val="1F2933"/>
+          <w:sz w:val="21"/>
+          <w:szCs w:val="21"/>
+        </w:rPr>
+        <w:t xml:space="preserve">, </w:t>
+      </w:r>
+      <w:r>
+        <w:rPr>
+          <w:rFonts w:ascii="Calibri" w:cs="Calibri" w:eastAsia="Calibri" w:hAnsi="Calibri"/>
+          <w:b/>
+          <w:bCs/>
+          <w:i w:val="false"/>
+          <w:iCs w:val="false"/>
+          <w:color w:val="1F2933"/>
+          <w:sz w:val="21"/>
+          <w:szCs w:val="21"/>
+        </w:rPr>
+        <w:t xml:space="preserve">còn phải thu</w:t>
+      </w:r>
+      <w:r>
+        <w:rPr>
+          <w:rFonts w:ascii="Calibri" w:cs="Calibri" w:eastAsia="Calibri" w:hAnsi="Calibri"/>
+          <w:b w:val="false"/>
+          <w:bCs w:val="false"/>
+          <w:i w:val="false"/>
+          <w:iCs w:val="false"/>
+          <w:color w:val="1F2933"/>
+          <w:sz w:val="21"/>
+          <w:szCs w:val="21"/>
+        </w:rPr>
+        <w:t xml:space="preserve">. Bấm </w:t>
+      </w:r>
+      <w:r>
+        <w:rPr>
+          <w:rFonts w:ascii="Calibri" w:cs="Calibri" w:eastAsia="Calibri" w:hAnsi="Calibri"/>
+          <w:b/>
+          <w:bCs/>
+          <w:i w:val="false"/>
+          <w:iCs w:val="false"/>
+          <w:color w:val="1F2933"/>
+          <w:sz w:val="21"/>
+          <w:szCs w:val="21"/>
+        </w:rPr>
+        <w:t xml:space="preserve">Đối soát</w:t>
+      </w:r>
+      <w:r>
+        <w:rPr>
+          <w:rFonts w:ascii="Calibri" w:cs="Calibri" w:eastAsia="Calibri" w:hAnsi="Calibri"/>
+          <w:b w:val="false"/>
+          <w:bCs w:val="false"/>
+          <w:i w:val="false"/>
+          <w:iCs w:val="false"/>
+          <w:color w:val="1F2933"/>
+          <w:sz w:val="21"/>
+          <w:szCs w:val="21"/>
+        </w:rPr>
+        <w:t xml:space="preserve"> để xem từng biên bản: ngày trả, số tiền, đã ký chưa, khoản phải thu tương ứng, đã thu bao nhiêu.</w:t>
+      </w:r>
+    </w:p>
+    <w:p>
+      <w:pPr>
+        <w:pStyle w:val="ListParagraph"/>
+        <w:numPr>
+          <w:ilvl w:val="0"/>
+          <w:numId w:val="2"/>
+        </w:numPr>
+        <w:spacing w:after="70" w:line="276"/>
+      </w:pPr>
+      <w:r>
+        <w:rPr>
+          <w:rFonts w:ascii="Calibri" w:cs="Calibri" w:eastAsia="Calibri" w:hAnsi="Calibri"/>
+          <w:b w:val="false"/>
+          <w:bCs w:val="false"/>
+          <w:i w:val="false"/>
+          <w:iCs w:val="false"/>
+          <w:color w:val="1F2933"/>
+          <w:sz w:val="21"/>
+          <w:szCs w:val="21"/>
+        </w:rPr>
+        <w:t xml:space="preserve">Tổng biên bản đã ký phải bằng tổng phải thu đã sinh. Lệch thì dòng đó hiện cảnh báo </w:t>
+      </w:r>
+      <w:r>
+        <w:rPr>
+          <w:rFonts w:ascii="Calibri" w:cs="Calibri" w:eastAsia="Calibri" w:hAnsi="Calibri"/>
+          <w:b/>
+          <w:bCs/>
+          <w:i w:val="false"/>
+          <w:iCs w:val="false"/>
+          <w:color w:val="1F2933"/>
+          <w:sz w:val="21"/>
+          <w:szCs w:val="21"/>
+        </w:rPr>
+        <w:t xml:space="preserve">Lệch</w:t>
+      </w:r>
+      <w:r>
+        <w:rPr>
+          <w:rFonts w:ascii="Calibri" w:cs="Calibri" w:eastAsia="Calibri" w:hAnsi="Calibri"/>
+          <w:b w:val="false"/>
+          <w:bCs w:val="false"/>
+          <w:i w:val="false"/>
+          <w:iCs w:val="false"/>
+          <w:color w:val="1F2933"/>
+          <w:sz w:val="21"/>
+          <w:szCs w:val="21"/>
+        </w:rPr>
+        <w:t xml:space="preserve">.</w:t>
+      </w:r>
+    </w:p>
+    <w:p>
+      <w:pPr>
+        <w:pStyle w:val="ListParagraph"/>
+        <w:numPr>
+          <w:ilvl w:val="0"/>
+          <w:numId w:val="2"/>
+        </w:numPr>
+        <w:spacing w:after="70" w:line="276"/>
+      </w:pPr>
+      <w:r>
+        <w:rPr>
+          <w:rFonts w:ascii="Calibri" w:cs="Calibri" w:eastAsia="Calibri" w:hAnsi="Calibri"/>
+          <w:b w:val="false"/>
+          <w:bCs w:val="false"/>
+          <w:i w:val="false"/>
+          <w:iCs w:val="false"/>
+          <w:color w:val="1F2933"/>
+          <w:sz w:val="21"/>
+          <w:szCs w:val="21"/>
+        </w:rPr>
+        <w:t xml:space="preserve">Tiền về: ghi nhận thu ở </w:t>
+      </w:r>
+      <w:r>
+        <w:rPr>
+          <w:rFonts w:ascii="Calibri" w:cs="Calibri" w:eastAsia="Calibri" w:hAnsi="Calibri"/>
+          <w:b/>
+          <w:bCs/>
+          <w:i w:val="false"/>
+          <w:iCs w:val="false"/>
+          <w:color w:val="1F2933"/>
+          <w:sz w:val="21"/>
+          <w:szCs w:val="21"/>
+        </w:rPr>
+        <w:t xml:space="preserve">Công nợ</w:t>
+      </w:r>
+      <w:r>
+        <w:rPr>
+          <w:rFonts w:ascii="Calibri" w:cs="Calibri" w:eastAsia="Calibri" w:hAnsi="Calibri"/>
+          <w:b w:val="false"/>
+          <w:bCs w:val="false"/>
+          <w:i w:val="false"/>
+          <w:iCs w:val="false"/>
+          <w:color w:val="1F2933"/>
+          <w:sz w:val="21"/>
+          <w:szCs w:val="21"/>
+        </w:rPr>
+        <w:t xml:space="preserve"> như mọi khoản khác. Hạn thu để trống cho tới khi Kế toán đặt (điều khoản thanh toán cho thuê chưa chốt).</w:t>
+      </w:r>
+    </w:p>
+    <w:p>
+      <w:pPr>
+        <w:pStyle w:val="ListParagraph"/>
+        <w:numPr>
+          <w:ilvl w:val="0"/>
+          <w:numId w:val="2"/>
+        </w:numPr>
+        <w:spacing w:after="70" w:line="276"/>
+      </w:pPr>
+      <w:r>
+        <w:rPr>
+          <w:rFonts w:ascii="Calibri" w:cs="Calibri" w:eastAsia="Calibri" w:hAnsi="Calibri"/>
+          <w:b w:val="false"/>
+          <w:bCs w:val="false"/>
+          <w:i w:val="false"/>
+          <w:iCs w:val="false"/>
+          <w:color w:val="1F2933"/>
+          <w:sz w:val="21"/>
+          <w:szCs w:val="21"/>
+        </w:rPr>
+        <w:t xml:space="preserve">Khách trả hết thì hợp đồng sang nhóm </w:t>
+      </w:r>
+      <w:r>
+        <w:rPr>
+          <w:rFonts w:ascii="Calibri" w:cs="Calibri" w:eastAsia="Calibri" w:hAnsi="Calibri"/>
+          <w:b/>
+          <w:bCs/>
+          <w:i w:val="false"/>
+          <w:iCs w:val="false"/>
+          <w:color w:val="1F2933"/>
+          <w:sz w:val="21"/>
+          <w:szCs w:val="21"/>
+        </w:rPr>
+        <w:t xml:space="preserve">Chờ tất toán</w:t>
+      </w:r>
+      <w:r>
+        <w:rPr>
+          <w:rFonts w:ascii="Calibri" w:cs="Calibri" w:eastAsia="Calibri" w:hAnsi="Calibri"/>
+          <w:b w:val="false"/>
+          <w:bCs w:val="false"/>
+          <w:i w:val="false"/>
+          <w:iCs w:val="false"/>
+          <w:color w:val="1F2933"/>
+          <w:sz w:val="21"/>
+          <w:szCs w:val="21"/>
+        </w:rPr>
+        <w:t xml:space="preserve">. Còn biên bản chưa ký thì nút </w:t>
+      </w:r>
+      <w:r>
+        <w:rPr>
+          <w:rFonts w:ascii="Calibri" w:cs="Calibri" w:eastAsia="Calibri" w:hAnsi="Calibri"/>
+          <w:b/>
+          <w:bCs/>
+          <w:i w:val="false"/>
+          <w:iCs w:val="false"/>
+          <w:color w:val="1F2933"/>
+          <w:sz w:val="21"/>
+          <w:szCs w:val="21"/>
+        </w:rPr>
+        <w:t xml:space="preserve">Tất toán hợp đồng</w:t>
+      </w:r>
+      <w:r>
+        <w:rPr>
+          <w:rFonts w:ascii="Calibri" w:cs="Calibri" w:eastAsia="Calibri" w:hAnsi="Calibri"/>
+          <w:b w:val="false"/>
+          <w:bCs w:val="false"/>
+          <w:i w:val="false"/>
+          <w:iCs w:val="false"/>
+          <w:color w:val="1F2933"/>
+          <w:sz w:val="21"/>
+          <w:szCs w:val="21"/>
+        </w:rPr>
+        <w:t xml:space="preserve"> bị khoá và ghi rõ lý do.</w:t>
+      </w:r>
+    </w:p>
+    <w:p>
+      <w:pPr>
+        <w:pStyle w:val="ListParagraph"/>
+        <w:numPr>
+          <w:ilvl w:val="0"/>
+          <w:numId w:val="2"/>
+        </w:numPr>
+        <w:spacing w:after="70" w:line="276"/>
+      </w:pPr>
+      <w:r>
+        <w:rPr>
+          <w:rFonts w:ascii="Calibri" w:cs="Calibri" w:eastAsia="Calibri" w:hAnsi="Calibri"/>
+          <w:b/>
+          <w:bCs/>
+          <w:i w:val="false"/>
+          <w:iCs w:val="false"/>
+          <w:color w:val="1F2933"/>
+          <w:sz w:val="21"/>
+          <w:szCs w:val="21"/>
+        </w:rPr>
+        <w:t xml:space="preserve">Tất toán hợp đồng</w:t>
+      </w:r>
+      <w:r>
+        <w:rPr>
+          <w:rFonts w:ascii="Calibri" w:cs="Calibri" w:eastAsia="Calibri" w:hAnsi="Calibri"/>
+          <w:b w:val="false"/>
+          <w:bCs w:val="false"/>
+          <w:i w:val="false"/>
+          <w:iCs w:val="false"/>
+          <w:color w:val="1F2933"/>
+          <w:sz w:val="21"/>
+          <w:szCs w:val="21"/>
+        </w:rPr>
+        <w:t xml:space="preserve">: hệ thống ghi chứng từ </w:t>
+      </w:r>
+      <w:r>
+        <w:rPr>
+          <w:rFonts w:ascii="Calibri" w:cs="Calibri" w:eastAsia="Calibri" w:hAnsi="Calibri"/>
+          <w:b/>
+          <w:bCs/>
+          <w:i w:val="false"/>
+          <w:iCs w:val="false"/>
+          <w:color w:val="1F2933"/>
+          <w:sz w:val="21"/>
+          <w:szCs w:val="21"/>
+        </w:rPr>
+        <w:t xml:space="preserve">cấn trừ tiền cọc</w:t>
+      </w:r>
+      <w:r>
+        <w:rPr>
+          <w:rFonts w:ascii="Calibri" w:cs="Calibri" w:eastAsia="Calibri" w:hAnsi="Calibri"/>
+          <w:b w:val="false"/>
+          <w:bCs w:val="false"/>
+          <w:i w:val="false"/>
+          <w:iCs w:val="false"/>
+          <w:color w:val="1F2933"/>
+          <w:sz w:val="21"/>
+          <w:szCs w:val="21"/>
+        </w:rPr>
+        <w:t xml:space="preserve"> vào phần còn phải thu. Cọc còn thừa thì lập </w:t>
+      </w:r>
+      <w:r>
+        <w:rPr>
+          <w:rFonts w:ascii="Calibri" w:cs="Calibri" w:eastAsia="Calibri" w:hAnsi="Calibri"/>
+          <w:b/>
+          <w:bCs/>
+          <w:i w:val="false"/>
+          <w:iCs w:val="false"/>
+          <w:color w:val="1F2933"/>
+          <w:sz w:val="21"/>
+          <w:szCs w:val="21"/>
+        </w:rPr>
+        <w:t xml:space="preserve">khoản phải trả hoàn cọc</w:t>
+      </w:r>
+      <w:r>
+        <w:rPr>
+          <w:rFonts w:ascii="Calibri" w:cs="Calibri" w:eastAsia="Calibri" w:hAnsi="Calibri"/>
+          <w:b w:val="false"/>
+          <w:bCs w:val="false"/>
+          <w:i w:val="false"/>
+          <w:iCs w:val="false"/>
+          <w:color w:val="1F2933"/>
+          <w:sz w:val="21"/>
+          <w:szCs w:val="21"/>
+        </w:rPr>
+        <w:t xml:space="preserve"> cho khách. Cọc không đủ thì phần còn lại vẫn phải thu tiếp. Hộp xác nhận nói trước các con số này; tất toán xong không hoàn tác được.</w:t>
       </w:r>
     </w:p>
     <w:p>
@@ -5481,7 +6069,7 @@
           <w:sz w:val="30"/>
           <w:szCs w:val="30"/>
         </w:rPr>
-        <w:t xml:space="preserve">11. Kỳ kế toán</w:t>
+        <w:t xml:space="preserve">11. Dòng tiền</w:t>
       </w:r>
     </w:p>
     <w:p>
@@ -5500,20 +6088,72 @@
           <w:sz w:val="21"/>
           <w:szCs w:val="21"/>
         </w:rPr>
-        <w:t xml:space="preserve">Kỳ kế toán</w:t>
-      </w:r>
-      <w:r>
-        <w:rPr>
-          <w:rFonts w:ascii="Calibri" w:cs="Calibri" w:eastAsia="Calibri" w:hAnsi="Calibri"/>
-          <w:b w:val="false"/>
-          <w:bCs w:val="false"/>
-          <w:i w:val="false"/>
-          <w:iCs w:val="false"/>
-          <w:color w:val="1F2933"/>
-          <w:sz w:val="21"/>
-          <w:szCs w:val="21"/>
-        </w:rPr>
-        <w:t xml:space="preserve"> — chốt sổ theo tháng.</w:t>
+        <w:t xml:space="preserve">Dòng tiền</w:t>
+      </w:r>
+      <w:r>
+        <w:rPr>
+          <w:rFonts w:ascii="Calibri" w:cs="Calibri" w:eastAsia="Calibri" w:hAnsi="Calibri"/>
+          <w:b w:val="false"/>
+          <w:bCs w:val="false"/>
+          <w:i w:val="false"/>
+          <w:iCs w:val="false"/>
+          <w:color w:val="1F2933"/>
+          <w:sz w:val="21"/>
+          <w:szCs w:val="21"/>
+        </w:rPr>
+        <w:t xml:space="preserve"> đặt cạnh nhau cho từng pháp nhân: số dư đầu kỳ, dự kiến thu, công nợ đến hạn thu, dự kiến chi, công nợ đến hạn trả, </w:t>
+      </w:r>
+      <w:r>
+        <w:rPr>
+          <w:rFonts w:ascii="Calibri" w:cs="Calibri" w:eastAsia="Calibri" w:hAnsi="Calibri"/>
+          <w:b/>
+          <w:bCs/>
+          <w:i w:val="false"/>
+          <w:iCs w:val="false"/>
+          <w:color w:val="1F2933"/>
+          <w:sz w:val="21"/>
+          <w:szCs w:val="21"/>
+        </w:rPr>
+        <w:t xml:space="preserve">khoản đã duyệt nhưng chưa chi</w:t>
+      </w:r>
+      <w:r>
+        <w:rPr>
+          <w:rFonts w:ascii="Calibri" w:cs="Calibri" w:eastAsia="Calibri" w:hAnsi="Calibri"/>
+          <w:b w:val="false"/>
+          <w:bCs w:val="false"/>
+          <w:i w:val="false"/>
+          <w:iCs w:val="false"/>
+          <w:color w:val="1F2933"/>
+          <w:sz w:val="21"/>
+          <w:szCs w:val="21"/>
+        </w:rPr>
+        <w:t xml:space="preserve">, và </w:t>
+      </w:r>
+      <w:r>
+        <w:rPr>
+          <w:rFonts w:ascii="Calibri" w:cs="Calibri" w:eastAsia="Calibri" w:hAnsi="Calibri"/>
+          <w:b/>
+          <w:bCs/>
+          <w:i w:val="false"/>
+          <w:iCs w:val="false"/>
+          <w:color w:val="1F2933"/>
+          <w:sz w:val="21"/>
+          <w:szCs w:val="21"/>
+        </w:rPr>
+        <w:t xml:space="preserve">số dư cuối kỳ dự kiến</w:t>
+      </w:r>
+      <w:r>
+        <w:rPr>
+          <w:rFonts w:ascii="Calibri" w:cs="Calibri" w:eastAsia="Calibri" w:hAnsi="Calibri"/>
+          <w:b w:val="false"/>
+          <w:bCs w:val="false"/>
+          <w:i w:val="false"/>
+          <w:iCs w:val="false"/>
+          <w:color w:val="1F2933"/>
+          <w:sz w:val="21"/>
+          <w:szCs w:val="21"/>
+        </w:rPr>
+        <w:t xml:space="preserve">. Chỗ âm được chỉ ra; hệ thống không kết luận nên hoãn khoản nào.</w:t>
       </w:r>
     </w:p>
     <w:p>
@@ -5577,7 +6217,178 @@
           <w:sz w:val="18"/>
           <w:szCs w:val="18"/>
         </w:rPr>
-        <w:t xml:space="preserve">Hình 14 — Kỳ kế toán — bản demo chưa mở kỳ nào.</w:t>
+        <w:t xml:space="preserve">Hình 14 — Dòng tiền tháng 9 của Nhà Việt Cons.</w:t>
+      </w:r>
+    </w:p>
+    <w:p>
+      <w:pPr>
+        <w:spacing w:after="140" w:line="276"/>
+        <w:jc w:val="left"/>
+      </w:pPr>
+      <w:r>
+        <w:rPr>
+          <w:rFonts w:ascii="Calibri" w:cs="Calibri" w:eastAsia="Calibri" w:hAnsi="Calibri"/>
+          <w:b/>
+          <w:bCs/>
+          <w:i w:val="false"/>
+          <w:iCs w:val="false"/>
+          <w:color w:val="1F2933"/>
+          <w:sz w:val="21"/>
+          <w:szCs w:val="21"/>
+        </w:rPr>
+        <w:t xml:space="preserve">Lập kế hoạch kỳ</w:t>
+      </w:r>
+      <w:r>
+        <w:rPr>
+          <w:rFonts w:ascii="Calibri" w:cs="Calibri" w:eastAsia="Calibri" w:hAnsi="Calibri"/>
+          <w:b w:val="false"/>
+          <w:bCs w:val="false"/>
+          <w:i w:val="false"/>
+          <w:iCs w:val="false"/>
+          <w:color w:val="1F2933"/>
+          <w:sz w:val="21"/>
+          <w:szCs w:val="21"/>
+        </w:rPr>
+        <w:t xml:space="preserve">: kỳ, từ ngày – đến ngày, </w:t>
+      </w:r>
+      <w:r>
+        <w:rPr>
+          <w:rFonts w:ascii="Calibri" w:cs="Calibri" w:eastAsia="Calibri" w:hAnsi="Calibri"/>
+          <w:b/>
+          <w:bCs/>
+          <w:i w:val="false"/>
+          <w:iCs w:val="false"/>
+          <w:color w:val="1F2933"/>
+          <w:sz w:val="21"/>
+          <w:szCs w:val="21"/>
+        </w:rPr>
+        <w:t xml:space="preserve">số dư đầu kỳ</w:t>
+      </w:r>
+      <w:r>
+        <w:rPr>
+          <w:rFonts w:ascii="Calibri" w:cs="Calibri" w:eastAsia="Calibri" w:hAnsi="Calibri"/>
+          <w:b w:val="false"/>
+          <w:bCs w:val="false"/>
+          <w:i w:val="false"/>
+          <w:iCs w:val="false"/>
+          <w:color w:val="1F2933"/>
+          <w:sz w:val="21"/>
+          <w:szCs w:val="21"/>
+        </w:rPr>
+        <w:t xml:space="preserve"> (nhập tay theo sao kê — hệ thống không nối ngân hàng điện tử), dự kiến thu, dự kiến chi, nguồn số dư. Chưa lập kế hoạch thì thẻ Dòng tiền trên Dashboard ghi «Chưa đủ dữ liệu» thay vì «0 đồng».</w:t>
+      </w:r>
+    </w:p>
+    <w:p>
+      <w:pPr>
+        <w:pStyle w:val="Heading1"/>
+        <w:spacing w:after="160" w:before="360"/>
+      </w:pPr>
+      <w:r>
+        <w:rPr>
+          <w:rFonts w:ascii="Calibri" w:cs="Calibri" w:eastAsia="Calibri" w:hAnsi="Calibri"/>
+          <w:b/>
+          <w:bCs/>
+          <w:color w:val="1F5F4B"/>
+          <w:sz w:val="30"/>
+          <w:szCs w:val="30"/>
+        </w:rPr>
+        <w:t xml:space="preserve">12. Kỳ kế toán</w:t>
+      </w:r>
+    </w:p>
+    <w:p>
+      <w:pPr>
+        <w:spacing w:after="140" w:line="276"/>
+        <w:jc w:val="left"/>
+      </w:pPr>
+      <w:r>
+        <w:rPr>
+          <w:rFonts w:ascii="Calibri" w:cs="Calibri" w:eastAsia="Calibri" w:hAnsi="Calibri"/>
+          <w:b/>
+          <w:bCs/>
+          <w:i w:val="false"/>
+          <w:iCs w:val="false"/>
+          <w:color w:val="1F2933"/>
+          <w:sz w:val="21"/>
+          <w:szCs w:val="21"/>
+        </w:rPr>
+        <w:t xml:space="preserve">Kỳ kế toán</w:t>
+      </w:r>
+      <w:r>
+        <w:rPr>
+          <w:rFonts w:ascii="Calibri" w:cs="Calibri" w:eastAsia="Calibri" w:hAnsi="Calibri"/>
+          <w:b w:val="false"/>
+          <w:bCs w:val="false"/>
+          <w:i w:val="false"/>
+          <w:iCs w:val="false"/>
+          <w:color w:val="1F2933"/>
+          <w:sz w:val="21"/>
+          <w:szCs w:val="21"/>
+        </w:rPr>
+        <w:t xml:space="preserve"> — chốt sổ theo tháng.</w:t>
+      </w:r>
+    </w:p>
+    <w:p>
+      <w:pPr>
+        <w:keepNext/>
+        <w:spacing w:after="60" w:before="160"/>
+        <w:jc w:val="center"/>
+      </w:pPr>
+      <w:r>
+        <w:drawing>
+          <wp:inline distT="0" distB="0" distL="0" distR="0">
+            <wp:extent cx="6191250" cy="3867150"/>
+            <wp:effectExtent t="0" r="0" b="0" l="0"/>
+            <wp:docPr id="15" name="" descr="" title=""/>
+            <wp:cNvGraphicFramePr>
+              <a:graphicFrameLocks xmlns:a="http://schemas.openxmlformats.org/drawingml/2006/main" noChangeAspect="1"/>
+            </wp:cNvGraphicFramePr>
+            <a:graphic xmlns:a="http://schemas.openxmlformats.org/drawingml/2006/main">
+              <a:graphicData uri="http://schemas.openxmlformats.org/drawingml/2006/picture">
+                <pic:pic xmlns:pic="http://schemas.openxmlformats.org/drawingml/2006/picture">
+                  <pic:nvPicPr>
+                    <pic:cNvPr id="0" name="" descr=""/>
+                    <pic:cNvPicPr>
+                      <a:picLocks noChangeAspect="1" noChangeArrowheads="1"/>
+                    </pic:cNvPicPr>
+                  </pic:nvPicPr>
+                  <pic:blipFill>
+                    <a:blip r:embed="rId23" cstate="none"/>
+                    <a:srcRect/>
+                    <a:stretch>
+                      <a:fillRect/>
+                    </a:stretch>
+                  </pic:blipFill>
+                  <pic:spPr bwMode="auto">
+                    <a:xfrm>
+                      <a:off x="0" y="0"/>
+                      <a:ext cx="6191250" cy="3867150"/>
+                    </a:xfrm>
+                    <a:prstGeom prst="rect">
+                      <a:avLst/>
+                    </a:prstGeom>
+                  </pic:spPr>
+                </pic:pic>
+              </a:graphicData>
+            </a:graphic>
+          </wp:inline>
+        </w:drawing>
+      </w:r>
+    </w:p>
+    <w:p>
+      <w:pPr>
+        <w:spacing w:after="200"/>
+        <w:jc w:val="center"/>
+      </w:pPr>
+      <w:r>
+        <w:rPr>
+          <w:rFonts w:ascii="Calibri" w:cs="Calibri" w:eastAsia="Calibri" w:hAnsi="Calibri"/>
+          <w:i/>
+          <w:iCs/>
+          <w:color w:val="52606D"/>
+          <w:sz w:val="18"/>
+          <w:szCs w:val="18"/>
+        </w:rPr>
+        <w:t xml:space="preserve">Hình 15 — Kỳ kế toán — bản demo chưa mở kỳ nào.</w:t>
       </w:r>
     </w:p>
     <w:p>
@@ -5750,7 +6561,7 @@
           <w:sz w:val="30"/>
           <w:szCs w:val="30"/>
         </w:rPr>
-        <w:t xml:space="preserve">12. Câu hỏi thường gặp</w:t>
+        <w:t xml:space="preserve">13. Câu hỏi thường gặp</w:t>
       </w:r>
     </w:p>
     <w:tbl>
@@ -5766,8 +6577,8 @@
         </w:tblBorders>
       </w:tblPr>
       <w:tblGrid>
-        <w:gridCol w:w="3684"/>
-        <w:gridCol w:w="5954"/>
+        <w:gridCol w:w="3738"/>
+        <w:gridCol w:w="5900"/>
       </w:tblGrid>
       <w:tr>
         <w:trPr>
@@ -5775,7 +6586,7 @@
         </w:trPr>
         <w:tc>
           <w:tcPr>
-            <w:tcW w:type="dxa" w:w="3684"/>
+            <w:tcW w:type="dxa" w:w="3738"/>
             <w:shd w:fill="EAF1EE" w:color="auto" w:val="clear"/>
             <w:tcMar>
               <w:top w:type="dxa" w:w="60"/>
@@ -5805,7 +6616,7 @@
         </w:tc>
         <w:tc>
           <w:tcPr>
-            <w:tcW w:type="dxa" w:w="5954"/>
+            <w:tcW w:type="dxa" w:w="5900"/>
             <w:shd w:fill="EAF1EE" w:color="auto" w:val="clear"/>
             <w:tcMar>
               <w:top w:type="dxa" w:w="60"/>
@@ -5840,7 +6651,7 @@
         </w:trPr>
         <w:tc>
           <w:tcPr>
-            <w:tcW w:type="dxa" w:w="3684"/>
+            <w:tcW w:type="dxa" w:w="3738"/>
             <w:tcMar>
               <w:top w:type="dxa" w:w="60"/>
               <w:left w:type="dxa" w:w="90"/>
@@ -5869,7 +6680,7 @@
         </w:tc>
         <w:tc>
           <w:tcPr>
-            <w:tcW w:type="dxa" w:w="5954"/>
+            <w:tcW w:type="dxa" w:w="5900"/>
             <w:tcMar>
               <w:top w:type="dxa" w:w="60"/>
               <w:left w:type="dxa" w:w="90"/>
@@ -5903,7 +6714,7 @@
         </w:trPr>
         <w:tc>
           <w:tcPr>
-            <w:tcW w:type="dxa" w:w="3684"/>
+            <w:tcW w:type="dxa" w:w="3738"/>
             <w:tcMar>
               <w:top w:type="dxa" w:w="60"/>
               <w:left w:type="dxa" w:w="90"/>
@@ -5958,7 +6769,7 @@
         </w:tc>
         <w:tc>
           <w:tcPr>
-            <w:tcW w:type="dxa" w:w="5954"/>
+            <w:tcW w:type="dxa" w:w="5900"/>
             <w:tcMar>
               <w:top w:type="dxa" w:w="60"/>
               <w:left w:type="dxa" w:w="90"/>
@@ -5992,7 +6803,7 @@
         </w:trPr>
         <w:tc>
           <w:tcPr>
-            <w:tcW w:type="dxa" w:w="3684"/>
+            <w:tcW w:type="dxa" w:w="3738"/>
             <w:tcMar>
               <w:top w:type="dxa" w:w="60"/>
               <w:left w:type="dxa" w:w="90"/>
@@ -6021,7 +6832,7 @@
         </w:tc>
         <w:tc>
           <w:tcPr>
-            <w:tcW w:type="dxa" w:w="5954"/>
+            <w:tcW w:type="dxa" w:w="5900"/>
             <w:tcMar>
               <w:top w:type="dxa" w:w="60"/>
               <w:left w:type="dxa" w:w="90"/>
@@ -6081,7 +6892,7 @@
         </w:trPr>
         <w:tc>
           <w:tcPr>
-            <w:tcW w:type="dxa" w:w="3684"/>
+            <w:tcW w:type="dxa" w:w="3738"/>
             <w:tcMar>
               <w:top w:type="dxa" w:w="60"/>
               <w:left w:type="dxa" w:w="90"/>
@@ -6110,7 +6921,7 @@
         </w:tc>
         <w:tc>
           <w:tcPr>
-            <w:tcW w:type="dxa" w:w="5954"/>
+            <w:tcW w:type="dxa" w:w="5900"/>
             <w:tcMar>
               <w:top w:type="dxa" w:w="60"/>
               <w:left w:type="dxa" w:w="90"/>
@@ -6170,7 +6981,7 @@
         </w:trPr>
         <w:tc>
           <w:tcPr>
-            <w:tcW w:type="dxa" w:w="3684"/>
+            <w:tcW w:type="dxa" w:w="3738"/>
             <w:tcMar>
               <w:top w:type="dxa" w:w="60"/>
               <w:left w:type="dxa" w:w="90"/>
@@ -6193,13 +7004,13 @@
                 <w:sz w:val="19"/>
                 <w:szCs w:val="19"/>
               </w:rPr>
-              <w:t xml:space="preserve">Số dư đầu kỳ lấy ở đâu?</w:t>
+              <w:t xml:space="preserve">Khoản phải thu tiền thuê giàn giáo từ đâu ra?</w:t>
             </w:r>
           </w:p>
         </w:tc>
         <w:tc>
           <w:tcPr>
-            <w:tcW w:type="dxa" w:w="5954"/>
+            <w:tcW w:type="dxa" w:w="5900"/>
             <w:tcMar>
               <w:top w:type="dxa" w:w="60"/>
               <w:left w:type="dxa" w:w="90"/>
@@ -6222,7 +7033,7 @@
                 <w:sz w:val="19"/>
                 <w:szCs w:val="19"/>
               </w:rPr>
-              <w:t xml:space="preserve">Nhập tay theo sao kê ngân hàng. Hệ thống không kết nối ngân hàng điện tử.</w:t>
+              <w:t xml:space="preserve">Từ biên bản thu hồi Xưởng đã ký với khách — mỗi biên bản một khoản. Biên bản chưa ký thì chưa có khoản phải thu.</w:t>
             </w:r>
           </w:p>
         </w:tc>
@@ -6233,7 +7044,7 @@
         </w:trPr>
         <w:tc>
           <w:tcPr>
-            <w:tcW w:type="dxa" w:w="3684"/>
+            <w:tcW w:type="dxa" w:w="3738"/>
             <w:tcMar>
               <w:top w:type="dxa" w:w="60"/>
               <w:left w:type="dxa" w:w="90"/>
@@ -6256,13 +7067,76 @@
                 <w:sz w:val="19"/>
                 <w:szCs w:val="19"/>
               </w:rPr>
-              <w:t xml:space="preserve">Có thay phần mềm kế toán không?</w:t>
+              <w:t xml:space="preserve">Số dư đầu kỳ lấy ở đâu?</w:t>
             </w:r>
           </w:p>
         </w:tc>
         <w:tc>
           <w:tcPr>
-            <w:tcW w:type="dxa" w:w="5954"/>
+            <w:tcW w:type="dxa" w:w="5900"/>
+            <w:tcMar>
+              <w:top w:type="dxa" w:w="60"/>
+              <w:left w:type="dxa" w:w="90"/>
+              <w:bottom w:type="dxa" w:w="60"/>
+              <w:right w:type="dxa" w:w="90"/>
+            </w:tcMar>
+          </w:tcPr>
+          <w:p>
+            <w:pPr>
+              <w:spacing w:after="0" w:line="252"/>
+            </w:pPr>
+            <w:r>
+              <w:rPr>
+                <w:rFonts w:ascii="Calibri" w:cs="Calibri" w:eastAsia="Calibri" w:hAnsi="Calibri"/>
+                <w:b w:val="false"/>
+                <w:bCs w:val="false"/>
+                <w:i w:val="false"/>
+                <w:iCs w:val="false"/>
+                <w:color w:val="1F2933"/>
+                <w:sz w:val="19"/>
+                <w:szCs w:val="19"/>
+              </w:rPr>
+              <w:t xml:space="preserve">Nhập tay theo sao kê ngân hàng. Hệ thống không kết nối ngân hàng điện tử.</w:t>
+            </w:r>
+          </w:p>
+        </w:tc>
+      </w:tr>
+      <w:tr>
+        <w:trPr>
+          <w:cantSplit/>
+        </w:trPr>
+        <w:tc>
+          <w:tcPr>
+            <w:tcW w:type="dxa" w:w="3738"/>
+            <w:tcMar>
+              <w:top w:type="dxa" w:w="60"/>
+              <w:left w:type="dxa" w:w="90"/>
+              <w:bottom w:type="dxa" w:w="60"/>
+              <w:right w:type="dxa" w:w="90"/>
+            </w:tcMar>
+          </w:tcPr>
+          <w:p>
+            <w:pPr>
+              <w:spacing w:after="0" w:line="252"/>
+            </w:pPr>
+            <w:r>
+              <w:rPr>
+                <w:rFonts w:ascii="Calibri" w:cs="Calibri" w:eastAsia="Calibri" w:hAnsi="Calibri"/>
+                <w:b w:val="false"/>
+                <w:bCs w:val="false"/>
+                <w:i w:val="false"/>
+                <w:iCs w:val="false"/>
+                <w:color w:val="1F2933"/>
+                <w:sz w:val="19"/>
+                <w:szCs w:val="19"/>
+              </w:rPr>
+              <w:t xml:space="preserve">Có thay phần mềm kế toán không?</w:t>
+            </w:r>
+          </w:p>
+        </w:tc>
+        <w:tc>
+          <w:tcPr>
+            <w:tcW w:type="dxa" w:w="5900"/>
             <w:tcMar>
               <w:top w:type="dxa" w:w="60"/>
               <w:left w:type="dxa" w:w="90"/>

</xml_diff>